<commit_message>
Final assignment for dylan🙏
</commit_message>
<xml_diff>
--- a/RRC/GameDev/4th semester/game dev 2/Personal ReflectionCole Dorman.docx
+++ b/RRC/GameDev/4th semester/game dev 2/Personal ReflectionCole Dorman.docx
@@ -131,6 +131,14 @@
     <w:p>
       <w:pPr>
         <w:rPr>
+          <w:sz w:val="22"/>
+          <w:szCs w:val="22"/>
+        </w:rPr>
+      </w:pPr>
+    </w:p>
+    <w:p>
+      <w:pPr>
+        <w:rPr>
           <w:b/>
           <w:bCs/>
           <w:sz w:val="22"/>
@@ -162,8 +170,57 @@
           <w:szCs w:val="22"/>
         </w:rPr>
         <w:tab/>
-        <w:t>I noticed the artists were very open to feedback regarding level design and did a great job implementing feedback they received. I also appreciated the clarity some students had provided when I needed to communicate with them. The final thing that I noticed was some students were ready to take initiative on tasks and if they had nothing assigned to them, they went out of their way to find ways to contribute to the project, instead of just complaining about it.</w:t>
-      </w:r>
+      </w:r>
+      <w:r>
+        <w:rPr>
+          <w:sz w:val="22"/>
+          <w:szCs w:val="22"/>
+        </w:rPr>
+        <w:t>The first thing I</w:t>
+      </w:r>
+      <w:r>
+        <w:rPr>
+          <w:sz w:val="22"/>
+          <w:szCs w:val="22"/>
+        </w:rPr>
+        <w:t xml:space="preserve"> noticed the artists were very open to feedback regarding level design and did a great job implementing feedback they received. </w:t>
+      </w:r>
+      <w:r>
+        <w:rPr>
+          <w:sz w:val="22"/>
+          <w:szCs w:val="22"/>
+        </w:rPr>
+        <w:t xml:space="preserve">The second thing I was aware of and </w:t>
+      </w:r>
+      <w:r>
+        <w:rPr>
+          <w:sz w:val="22"/>
+          <w:szCs w:val="22"/>
+        </w:rPr>
+        <w:t xml:space="preserve">appreciated </w:t>
+      </w:r>
+      <w:r>
+        <w:rPr>
+          <w:sz w:val="22"/>
+          <w:szCs w:val="22"/>
+        </w:rPr>
+        <w:t xml:space="preserve">was </w:t>
+      </w:r>
+      <w:r>
+        <w:rPr>
+          <w:sz w:val="22"/>
+          <w:szCs w:val="22"/>
+        </w:rPr>
+        <w:t>the clarity some students had provided when I needed to communicate with them. The final thing that I noticed was some students were ready to take initiative on tasks and if they had nothing assigned to them, they went out of their way to find ways to contribute to the project, instead of just complaining about it.</w:t>
+      </w:r>
+    </w:p>
+    <w:p>
+      <w:pPr>
+        <w:rPr>
+          <w:sz w:val="22"/>
+          <w:szCs w:val="22"/>
+        </w:rPr>
+      </w:pPr>
     </w:p>
     <w:p>
       <w:pPr>
@@ -211,6 +268,14 @@
     <w:p>
       <w:pPr>
         <w:rPr>
+          <w:sz w:val="22"/>
+          <w:szCs w:val="22"/>
+        </w:rPr>
+      </w:pPr>
+    </w:p>
+    <w:p>
+      <w:pPr>
+        <w:rPr>
           <w:b/>
           <w:bCs/>
           <w:sz w:val="22"/>
@@ -250,31 +315,13 @@
         </w:rPr>
         <w:t xml:space="preserve">I feel I dealt with </w:t>
       </w:r>
-      <w:proofErr w:type="gramStart"/>
-      <w:r>
-        <w:rPr>
-          <w:sz w:val="22"/>
-          <w:szCs w:val="22"/>
-        </w:rPr>
-        <w:t>an</w:t>
-      </w:r>
-      <w:proofErr w:type="gramEnd"/>
-      <w:r>
-        <w:rPr>
-          <w:sz w:val="22"/>
-          <w:szCs w:val="22"/>
-        </w:rPr>
-        <w:t xml:space="preserve"> massive </w:t>
-      </w:r>
-      <w:proofErr w:type="gramStart"/>
-      <w:r>
-        <w:rPr>
-          <w:sz w:val="22"/>
-          <w:szCs w:val="22"/>
-        </w:rPr>
-        <w:t>amount</w:t>
-      </w:r>
-      <w:proofErr w:type="gramEnd"/>
+      <w:r>
+        <w:rPr>
+          <w:sz w:val="22"/>
+          <w:szCs w:val="22"/>
+        </w:rPr>
+        <w:t>excessive number</w:t>
+      </w:r>
       <w:r>
         <w:rPr>
           <w:sz w:val="22"/>
@@ -282,22 +329,49 @@
         </w:rPr>
         <w:t xml:space="preserve"> of uncomfortable situations and lack of </w:t>
       </w:r>
-      <w:proofErr w:type="gramStart"/>
-      <w:r>
-        <w:rPr>
-          <w:sz w:val="22"/>
-          <w:szCs w:val="22"/>
-        </w:rPr>
-        <w:t>professionalism, and</w:t>
-      </w:r>
-      <w:proofErr w:type="gramEnd"/>
-      <w:r>
-        <w:rPr>
-          <w:sz w:val="22"/>
-          <w:szCs w:val="22"/>
-        </w:rPr>
-        <w:t xml:space="preserve"> did my best to not cave in to the toxicity.</w:t>
-      </w:r>
+      <w:r>
+        <w:rPr>
+          <w:sz w:val="22"/>
+          <w:szCs w:val="22"/>
+        </w:rPr>
+        <w:t>professionalism and</w:t>
+      </w:r>
+      <w:r>
+        <w:rPr>
+          <w:sz w:val="22"/>
+          <w:szCs w:val="22"/>
+        </w:rPr>
+        <w:t xml:space="preserve"> did my best </w:t>
+      </w:r>
+      <w:r>
+        <w:rPr>
+          <w:sz w:val="22"/>
+          <w:szCs w:val="22"/>
+        </w:rPr>
+        <w:t>not to</w:t>
+      </w:r>
+      <w:r>
+        <w:rPr>
+          <w:sz w:val="22"/>
+          <w:szCs w:val="22"/>
+        </w:rPr>
+        <w:t xml:space="preserve"> cave in to the toxicity.</w:t>
+      </w:r>
+      <w:r>
+        <w:rPr>
+          <w:sz w:val="22"/>
+          <w:szCs w:val="22"/>
+        </w:rPr>
+        <w:t xml:space="preserve"> While I am in no way perfect, the one thing I try to do is continually improve, and I feel I also have done well at that throughout the semester, by acknowledging weaknesses and improving on them.</w:t>
+      </w:r>
+    </w:p>
+    <w:p>
+      <w:pPr>
+        <w:rPr>
+          <w:sz w:val="22"/>
+          <w:szCs w:val="22"/>
+        </w:rPr>
+      </w:pPr>
     </w:p>
     <w:p>
       <w:pPr>
@@ -323,6 +397,45 @@
     <w:p>
       <w:pPr>
         <w:rPr>
+          <w:sz w:val="22"/>
+          <w:szCs w:val="22"/>
+        </w:rPr>
+      </w:pPr>
+      <w:r>
+        <w:rPr>
+          <w:sz w:val="22"/>
+          <w:szCs w:val="22"/>
+        </w:rPr>
+        <w:lastRenderedPageBreak/>
+        <w:tab/>
+        <w:t xml:space="preserve">The biggest impact the skills above would have impacted others would be primarily avoiding the spread of such negative feelings spread to others. As for my effort to continual improvement, I feel this impacts others across the board in all aspects, if I were to stay rigid and not take accountability for issues brought up, conditions and </w:t>
+      </w:r>
+      <w:r>
+        <w:rPr>
+          <w:sz w:val="22"/>
+          <w:szCs w:val="22"/>
+        </w:rPr>
+        <w:t xml:space="preserve">potential </w:t>
+      </w:r>
+      <w:r>
+        <w:rPr>
+          <w:sz w:val="22"/>
+          <w:szCs w:val="22"/>
+        </w:rPr>
+        <w:t>resulting conflicts would never improve or cease.</w:t>
+      </w:r>
+    </w:p>
+    <w:p>
+      <w:pPr>
+        <w:rPr>
+          <w:sz w:val="22"/>
+          <w:szCs w:val="22"/>
+        </w:rPr>
+      </w:pPr>
+    </w:p>
+    <w:p>
+      <w:pPr>
+        <w:rPr>
           <w:b/>
           <w:bCs/>
           <w:sz w:val="22"/>
@@ -355,6 +468,49 @@
         </w:rPr>
         <w:tab/>
       </w:r>
+      <w:r>
+        <w:rPr>
+          <w:sz w:val="22"/>
+          <w:szCs w:val="22"/>
+        </w:rPr>
+        <w:t xml:space="preserve">I think of the skills that I had </w:t>
+      </w:r>
+      <w:r>
+        <w:rPr>
+          <w:sz w:val="22"/>
+          <w:szCs w:val="22"/>
+        </w:rPr>
+        <w:t xml:space="preserve">used mostly to the benefit of others in the project would be </w:t>
+      </w:r>
+      <w:r>
+        <w:rPr>
+          <w:sz w:val="22"/>
+          <w:szCs w:val="22"/>
+        </w:rPr>
+        <w:t>adaptability</w:t>
+      </w:r>
+      <w:r>
+        <w:rPr>
+          <w:sz w:val="22"/>
+          <w:szCs w:val="22"/>
+        </w:rPr>
+        <w:t xml:space="preserve"> as well as prioritization. These were both critical with the work I am doing as I need to be responsive to the needs of the team, when the artists had shifted from PLAs to PLIs it required me to re-prioritize my tasks and also adapt to the new system that was implemented. Given the short notice </w:t>
+      </w:r>
+      <w:r>
+        <w:rPr>
+          <w:sz w:val="22"/>
+          <w:szCs w:val="22"/>
+        </w:rPr>
+        <w:t>this challenged my adaptability and prioritization skills directly.</w:t>
+      </w:r>
+    </w:p>
+    <w:p>
+      <w:pPr>
+        <w:rPr>
+          <w:sz w:val="22"/>
+          <w:szCs w:val="22"/>
+        </w:rPr>
+      </w:pPr>
     </w:p>
     <w:p>
       <w:pPr>
@@ -438,7 +594,35 @@
           <w:sz w:val="22"/>
           <w:szCs w:val="22"/>
         </w:rPr>
-        <w:t>keeping composure in very stressful situations.</w:t>
+        <w:t xml:space="preserve">keeping composure in </w:t>
+      </w:r>
+      <w:r>
+        <w:rPr>
+          <w:sz w:val="22"/>
+          <w:szCs w:val="22"/>
+        </w:rPr>
+        <w:t>high</w:t>
+      </w:r>
+      <w:r>
+        <w:rPr>
+          <w:sz w:val="22"/>
+          <w:szCs w:val="22"/>
+        </w:rPr>
+        <w:t xml:space="preserve"> stress situations.</w:t>
+      </w:r>
+      <w:r>
+        <w:rPr>
+          <w:sz w:val="22"/>
+          <w:szCs w:val="22"/>
+        </w:rPr>
+        <w:t xml:space="preserve"> As </w:t>
+      </w:r>
+      <w:r>
+        <w:rPr>
+          <w:sz w:val="22"/>
+          <w:szCs w:val="22"/>
+        </w:rPr>
+        <w:t>I am well aware I will be in more high stress situations in my professional career, so it is beneficial for my mental health and my professional image to be able to stay calm and collected during these encounters.</w:t>
       </w:r>
     </w:p>
     <w:p>
@@ -522,6 +706,14 @@
         <w:rPr>
           <w:sz w:val="22"/>
           <w:szCs w:val="22"/>
+        </w:rPr>
+      </w:pPr>
+    </w:p>
+    <w:p>
+      <w:pPr>
+        <w:rPr>
+          <w:sz w:val="22"/>
+          <w:szCs w:val="22"/>
           <w:u w:val="single"/>
         </w:rPr>
       </w:pPr>
@@ -562,7 +754,6 @@
         </w:rPr>
         <w:tab/>
       </w:r>
-      <w:proofErr w:type="gramStart"/>
       <w:r>
         <w:rPr>
           <w:sz w:val="22"/>
@@ -570,7 +761,13 @@
         </w:rPr>
         <w:t>Firstly</w:t>
       </w:r>
-      <w:proofErr w:type="gramEnd"/>
+      <w:r>
+        <w:rPr>
+          <w:sz w:val="22"/>
+          <w:szCs w:val="22"/>
+        </w:rPr>
+        <w:t>,</w:t>
+      </w:r>
       <w:r>
         <w:rPr>
           <w:sz w:val="22"/>
@@ -602,6 +799,16 @@
           <w:bCs/>
           <w:sz w:val="22"/>
           <w:szCs w:val="22"/>
+        </w:rPr>
+      </w:pPr>
+    </w:p>
+    <w:p>
+      <w:pPr>
+        <w:rPr>
+          <w:b/>
+          <w:bCs/>
+          <w:sz w:val="22"/>
+          <w:szCs w:val="22"/>
           <w:u w:val="single"/>
         </w:rPr>
       </w:pPr>
@@ -638,15 +845,13 @@
         </w:rPr>
         <w:t xml:space="preserve"> I think a change that would benefit future students, would be to (early on) assign a small group of students who are familiar with the game that the project is based </w:t>
       </w:r>
-      <w:proofErr w:type="gramStart"/>
-      <w:r>
-        <w:rPr>
-          <w:sz w:val="22"/>
-          <w:szCs w:val="22"/>
-        </w:rPr>
-        <w:t>off of</w:t>
-      </w:r>
-      <w:proofErr w:type="gramEnd"/>
+      <w:r>
+        <w:rPr>
+          <w:sz w:val="22"/>
+          <w:szCs w:val="22"/>
+        </w:rPr>
+        <w:t>off</w:t>
+      </w:r>
       <w:r>
         <w:rPr>
           <w:sz w:val="22"/>
@@ -658,74 +863,18 @@
     <w:p>
       <w:pPr>
         <w:rPr>
-          <w:bCs/>
-          <w:sz w:val="22"/>
-          <w:szCs w:val="22"/>
-        </w:rPr>
-      </w:pPr>
-      <w:r>
-        <w:rPr>
-          <w:b/>
-          <w:bCs/>
-          <w:sz w:val="22"/>
-          <w:szCs w:val="22"/>
-          <w:u w:val="single"/>
-        </w:rPr>
-        <w:br/>
-      </w:r>
-      <w:r>
-        <w:rPr>
-          <w:bCs/>
-          <w:sz w:val="22"/>
-          <w:szCs w:val="22"/>
-        </w:rPr>
-        <w:t xml:space="preserve">Task Overview: Complete the questions above and provide a professionally formatted document as a PDF (no word docs, links, etc.). Assignment Guidelines, FAQ and Hand In procedure: </w:t>
-      </w:r>
-    </w:p>
-    <w:p>
-      <w:pPr>
-        <w:rPr>
-          <w:sz w:val="22"/>
-          <w:szCs w:val="22"/>
-        </w:rPr>
-      </w:pPr>
-      <w:r>
-        <w:rPr>
-          <w:sz w:val="22"/>
-          <w:szCs w:val="22"/>
-        </w:rPr>
-        <w:t xml:space="preserve">• Your header should include your name, class name, assignment number, a reasonable title (“My Reflection” etc.) and date. Document formatting, naming, and presentation are assessed under ‘Professionalism, Clarity, and Reflection Quality. </w:t>
-      </w:r>
-    </w:p>
-    <w:p>
-      <w:pPr>
-        <w:rPr>
-          <w:sz w:val="22"/>
-          <w:szCs w:val="22"/>
-        </w:rPr>
-      </w:pPr>
-      <w:r>
-        <w:rPr>
-          <w:sz w:val="22"/>
-          <w:szCs w:val="22"/>
-        </w:rPr>
-        <w:t xml:space="preserve">• Your document should follow consistent naming guidelines [ e.g. GD2_A4_DylanF.PDF] </w:t>
-      </w:r>
-    </w:p>
-    <w:p>
-      <w:pPr>
-        <w:rPr>
-          <w:sz w:val="22"/>
-          <w:szCs w:val="22"/>
-        </w:rPr>
-      </w:pPr>
-      <w:r>
-        <w:rPr>
-          <w:sz w:val="22"/>
-          <w:szCs w:val="22"/>
-        </w:rPr>
-        <w:t>• Your document should be professionally formatted (Titles larger than text, some effort to lay out elements, proper spacing, reasonable fonts etc.) • You should use complete paragraphs and full sentences.</w:t>
-      </w:r>
+          <w:sz w:val="22"/>
+          <w:szCs w:val="22"/>
+        </w:rPr>
+      </w:pPr>
+    </w:p>
+    <w:p>
+      <w:pPr>
+        <w:rPr>
+          <w:sz w:val="22"/>
+          <w:szCs w:val="22"/>
+        </w:rPr>
+      </w:pPr>
     </w:p>
     <w:sectPr>
       <w:pgSz w:w="12240" w:h="15840"/>
@@ -1340,6 +1489,7 @@
   <w:style w:type="character" w:default="1" w:styleId="DefaultParagraphFont">
     <w:name w:val="Default Paragraph Font"/>
     <w:uiPriority w:val="1"/>
+    <w:semiHidden/>
     <w:unhideWhenUsed/>
   </w:style>
   <w:style w:type="table" w:default="1" w:styleId="TableNormal">

</xml_diff>

<commit_message>
last week of school and im kinda terrified of going into industry.
</commit_message>
<xml_diff>
--- a/RRC/GameDev/4th semester/game dev 2/Personal ReflectionCole Dorman.docx
+++ b/RRC/GameDev/4th semester/game dev 2/Personal ReflectionCole Dorman.docx
@@ -68,7 +68,29 @@
           <w:szCs w:val="22"/>
           <w:u w:val="single"/>
         </w:rPr>
-        <w:t>What are three things you learned about the game development in general this semester?</w:t>
+        <w:t xml:space="preserve">What are three things you learned about </w:t>
+      </w:r>
+      <w:proofErr w:type="gramStart"/>
+      <w:r>
+        <w:rPr>
+          <w:b/>
+          <w:bCs/>
+          <w:sz w:val="22"/>
+          <w:szCs w:val="22"/>
+          <w:u w:val="single"/>
+        </w:rPr>
+        <w:t>the game</w:t>
+      </w:r>
+      <w:proofErr w:type="gramEnd"/>
+      <w:r>
+        <w:rPr>
+          <w:b/>
+          <w:bCs/>
+          <w:sz w:val="22"/>
+          <w:szCs w:val="22"/>
+          <w:u w:val="single"/>
+        </w:rPr>
+        <w:t xml:space="preserve"> development in general this semester?</w:t>
       </w:r>
     </w:p>
     <w:p>
@@ -183,7 +205,23 @@
           <w:sz w:val="22"/>
           <w:szCs w:val="22"/>
         </w:rPr>
-        <w:t xml:space="preserve"> noticed the artists were very open to feedback regarding level design and did a great job implementing feedback they received. </w:t>
+        <w:t xml:space="preserve"> noticed </w:t>
+      </w:r>
+      <w:proofErr w:type="gramStart"/>
+      <w:r>
+        <w:rPr>
+          <w:sz w:val="22"/>
+          <w:szCs w:val="22"/>
+        </w:rPr>
+        <w:t>the</w:t>
+      </w:r>
+      <w:proofErr w:type="gramEnd"/>
+      <w:r>
+        <w:rPr>
+          <w:sz w:val="22"/>
+          <w:szCs w:val="22"/>
+        </w:rPr>
+        <w:t xml:space="preserve"> artists were very open to feedback regarding level design and did a great job implementing feedback they received. </w:t>
       </w:r>
       <w:r>
         <w:rPr>
@@ -211,7 +249,23 @@
           <w:sz w:val="22"/>
           <w:szCs w:val="22"/>
         </w:rPr>
-        <w:t>the clarity some students had provided when I needed to communicate with them. The final thing that I noticed was some students were ready to take initiative on tasks and if they had nothing assigned to them, they went out of their way to find ways to contribute to the project, instead of just complaining about it.</w:t>
+        <w:t xml:space="preserve">the clarity some students had provided when I needed to communicate with them. The final thing that I noticed was some students were ready to take initiative on tasks and if they had </w:t>
+      </w:r>
+      <w:proofErr w:type="gramStart"/>
+      <w:r>
+        <w:rPr>
+          <w:sz w:val="22"/>
+          <w:szCs w:val="22"/>
+        </w:rPr>
+        <w:t>nothing assigned</w:t>
+      </w:r>
+      <w:proofErr w:type="gramEnd"/>
+      <w:r>
+        <w:rPr>
+          <w:sz w:val="22"/>
+          <w:szCs w:val="22"/>
+        </w:rPr>
+        <w:t xml:space="preserve"> to them, they went out of their way to find ways to contribute to the project, instead of just complaining about it.</w:t>
       </w:r>
     </w:p>
     <w:p>
@@ -262,7 +316,39 @@
           <w:sz w:val="22"/>
           <w:szCs w:val="22"/>
         </w:rPr>
-        <w:t>An obvious example of the why the feedback to level design was important is, initially play testers did not find the level fun. Once feedback was provided, they overhauled it, and it was far better received next playtest. Clarity in communication is critical to prevent misunderstandings and conflicts as well as preventing wasted time and work. Students taking initiative is important as instructors cannot manage everyone effectively, and it improves morale in contrast to complaining.</w:t>
+        <w:t xml:space="preserve">An obvious example of </w:t>
+      </w:r>
+      <w:proofErr w:type="gramStart"/>
+      <w:r>
+        <w:rPr>
+          <w:sz w:val="22"/>
+          <w:szCs w:val="22"/>
+        </w:rPr>
+        <w:t>the</w:t>
+      </w:r>
+      <w:proofErr w:type="gramEnd"/>
+      <w:r>
+        <w:rPr>
+          <w:sz w:val="22"/>
+          <w:szCs w:val="22"/>
+        </w:rPr>
+        <w:t xml:space="preserve"> why the feedback to level design was important is, initially play testers did not find the level fun. Once feedback was provided, they overhauled it, and it was far better </w:t>
+      </w:r>
+      <w:proofErr w:type="gramStart"/>
+      <w:r>
+        <w:rPr>
+          <w:sz w:val="22"/>
+          <w:szCs w:val="22"/>
+        </w:rPr>
+        <w:t>received</w:t>
+      </w:r>
+      <w:proofErr w:type="gramEnd"/>
+      <w:r>
+        <w:rPr>
+          <w:sz w:val="22"/>
+          <w:szCs w:val="22"/>
+        </w:rPr>
+        <w:t xml:space="preserve"> next playtest. Clarity in communication is critical to prevent misunderstandings and conflicts as well as preventing wasted time and work. Students taking initiative is important as instructors cannot manage everyone effectively, and it improves morale in contrast to complaining.</w:t>
       </w:r>
     </w:p>
     <w:p>
@@ -391,7 +477,29 @@
           <w:szCs w:val="22"/>
           <w:u w:val="single"/>
         </w:rPr>
-        <w:t xml:space="preserve">How did each of the things you did well contribute to the project, class, or supporting your classmates? Provide a sentence on each. </w:t>
+        <w:t xml:space="preserve">How did each of the things you did well contribute to the project, class, or </w:t>
+      </w:r>
+      <w:proofErr w:type="gramStart"/>
+      <w:r>
+        <w:rPr>
+          <w:b/>
+          <w:bCs/>
+          <w:sz w:val="22"/>
+          <w:szCs w:val="22"/>
+          <w:u w:val="single"/>
+        </w:rPr>
+        <w:t>supporting</w:t>
+      </w:r>
+      <w:proofErr w:type="gramEnd"/>
+      <w:r>
+        <w:rPr>
+          <w:b/>
+          <w:bCs/>
+          <w:sz w:val="22"/>
+          <w:szCs w:val="22"/>
+          <w:u w:val="single"/>
+        </w:rPr>
+        <w:t xml:space="preserve"> your classmates? Provide a sentence on each. </w:t>
       </w:r>
     </w:p>
     <w:p>
@@ -408,7 +516,23 @@
         </w:rPr>
         <w:lastRenderedPageBreak/>
         <w:tab/>
-        <w:t xml:space="preserve">The biggest impact the skills above would have impacted others would be primarily avoiding the spread of such negative feelings spread to others. As for my effort to continual improvement, I feel this impacts others across the board in all aspects, if I were to stay rigid and not take accountability for issues brought up, conditions and </w:t>
+        <w:t xml:space="preserve">The biggest impact the skills above would have </w:t>
+      </w:r>
+      <w:proofErr w:type="gramStart"/>
+      <w:r>
+        <w:rPr>
+          <w:sz w:val="22"/>
+          <w:szCs w:val="22"/>
+        </w:rPr>
+        <w:t>impacted</w:t>
+      </w:r>
+      <w:proofErr w:type="gramEnd"/>
+      <w:r>
+        <w:rPr>
+          <w:sz w:val="22"/>
+          <w:szCs w:val="22"/>
+        </w:rPr>
+        <w:t xml:space="preserve"> others would be primarily avoiding the spread of such negative feelings spread to others. As for my effort to continual improvement, I feel this impacts others across the board in all aspects, if I were to stay rigid and not take accountability for issues brought up, conditions and </w:t>
       </w:r>
       <w:r>
         <w:rPr>
@@ -843,7 +967,23 @@
           <w:sz w:val="22"/>
           <w:szCs w:val="22"/>
         </w:rPr>
-        <w:t xml:space="preserve"> I think a change that would benefit future students, would be to (early on) assign a small group of students who are familiar with the game that the project is based </w:t>
+        <w:t xml:space="preserve"> I think a change that would benefit future </w:t>
+      </w:r>
+      <w:proofErr w:type="gramStart"/>
+      <w:r>
+        <w:rPr>
+          <w:sz w:val="22"/>
+          <w:szCs w:val="22"/>
+        </w:rPr>
+        <w:t>students,</w:t>
+      </w:r>
+      <w:proofErr w:type="gramEnd"/>
+      <w:r>
+        <w:rPr>
+          <w:sz w:val="22"/>
+          <w:szCs w:val="22"/>
+        </w:rPr>
+        <w:t xml:space="preserve"> would be to (early on) assign a small group of students who are familiar with the game that the project is based </w:t>
       </w:r>
       <w:r>
         <w:rPr>
@@ -857,7 +997,39 @@
           <w:sz w:val="22"/>
           <w:szCs w:val="22"/>
         </w:rPr>
-        <w:t>, as the CCOs, and have the discuss and ensure that they are on the same page. Then can act as that anchor that we so desperately needed.</w:t>
+        <w:t xml:space="preserve">, </w:t>
+      </w:r>
+      <w:proofErr w:type="gramStart"/>
+      <w:r>
+        <w:rPr>
+          <w:sz w:val="22"/>
+          <w:szCs w:val="22"/>
+        </w:rPr>
+        <w:t>as</w:t>
+      </w:r>
+      <w:proofErr w:type="gramEnd"/>
+      <w:r>
+        <w:rPr>
+          <w:sz w:val="22"/>
+          <w:szCs w:val="22"/>
+        </w:rPr>
+        <w:t xml:space="preserve"> the CCOs, and have the </w:t>
+      </w:r>
+      <w:proofErr w:type="gramStart"/>
+      <w:r>
+        <w:rPr>
+          <w:sz w:val="22"/>
+          <w:szCs w:val="22"/>
+        </w:rPr>
+        <w:t>discuss</w:t>
+      </w:r>
+      <w:proofErr w:type="gramEnd"/>
+      <w:r>
+        <w:rPr>
+          <w:sz w:val="22"/>
+          <w:szCs w:val="22"/>
+        </w:rPr>
+        <w:t xml:space="preserve"> and ensure that they are on the same page. Then can act as that anchor that we so desperately needed.</w:t>
       </w:r>
     </w:p>
     <w:p>

</xml_diff>